<commit_message>
Ajustes no menu e gitignore
</commit_message>
<xml_diff>
--- a/projeto_equalizacao/output/relatorio_equalizacao.docx
+++ b/projeto_equalizacao/output/relatorio_equalizacao.docx
@@ -38,11 +38,11 @@
         <w:br/>
       </w:r>
       <w:r>
-        <w:t>Data de geracao: 24/07/2026 11:29</w:t>
+        <w:t>Data de geracao: 03/08/2026 16:46</w:t>
         <w:br/>
       </w:r>
       <w:r>
-        <w:t>Arquivos utilizados: 23</w:t>
+        <w:t>Arquivos utilizados: 33</w:t>
       </w:r>
     </w:p>
     <w:p>
@@ -251,6 +251,86 @@
       </w:r>
     </w:p>
     <w:p>
+      <w:pPr>
+        <w:pStyle w:val="ListBullet"/>
+      </w:pPr>
+      <w:r>
+        <w:t>processos_24-07-2026.CSV</w:t>
+      </w:r>
+    </w:p>
+    <w:p>
+      <w:pPr>
+        <w:pStyle w:val="ListBullet"/>
+      </w:pPr>
+      <w:r>
+        <w:t>processos_25-07-2026.CSV</w:t>
+      </w:r>
+    </w:p>
+    <w:p>
+      <w:pPr>
+        <w:pStyle w:val="ListBullet"/>
+      </w:pPr>
+      <w:r>
+        <w:t>processos_26-07-2026.CSV</w:t>
+      </w:r>
+    </w:p>
+    <w:p>
+      <w:pPr>
+        <w:pStyle w:val="ListBullet"/>
+      </w:pPr>
+      <w:r>
+        <w:t>processos_27-07-2026.CSV</w:t>
+      </w:r>
+    </w:p>
+    <w:p>
+      <w:pPr>
+        <w:pStyle w:val="ListBullet"/>
+      </w:pPr>
+      <w:r>
+        <w:t>processos_28-07-2026.CSV</w:t>
+      </w:r>
+    </w:p>
+    <w:p>
+      <w:pPr>
+        <w:pStyle w:val="ListBullet"/>
+      </w:pPr>
+      <w:r>
+        <w:t>processos_29-07-2026.CSV</w:t>
+      </w:r>
+    </w:p>
+    <w:p>
+      <w:pPr>
+        <w:pStyle w:val="ListBullet"/>
+      </w:pPr>
+      <w:r>
+        <w:t>processos_30-07-2026.CSV</w:t>
+      </w:r>
+    </w:p>
+    <w:p>
+      <w:pPr>
+        <w:pStyle w:val="ListBullet"/>
+      </w:pPr>
+      <w:r>
+        <w:t>processos_31-07-2026.CSV</w:t>
+      </w:r>
+    </w:p>
+    <w:p>
+      <w:pPr>
+        <w:pStyle w:val="ListBullet"/>
+      </w:pPr>
+      <w:r>
+        <w:t>processos_01-08-2026.CSV</w:t>
+      </w:r>
+    </w:p>
+    <w:p>
+      <w:pPr>
+        <w:pStyle w:val="ListBullet"/>
+      </w:pPr>
+      <w:r>
+        <w:t>processos_02-08-2026.CSV</w:t>
+      </w:r>
+    </w:p>
+    <w:p>
       <w:r>
         <w:t>Filtros aplicados: Nenhum (relatorio padrao via linha de comando)</w:t>
       </w:r>
@@ -273,7 +353,7 @@
     </w:p>
     <w:p>
       <w:r>
-        <w:t>No periodo analisado foram identificados 8.407 casos novos, dos quais 691 (8,2%) foram equalizados validamente pelo Sistema de Equalizacao. A adocao do sistema reduziu a dispersao entre unidades em 25,0% em relacao ao cenario simulado sem equalizacao.</w:t>
+        <w:t>No periodo analisado foram identificados 12.976 casos novos, dos quais 921 (7,1%) foram equalizados validamente pelo Sistema de Equalizacao. A adocao do sistema reduziu a dispersao entre unidades em 27,9% em relacao ao cenario simulado sem equalizacao.</w:t>
       </w:r>
     </w:p>
     <w:tbl>
@@ -335,7 +415,7 @@
           </w:tcPr>
           <w:p>
             <w:r>
-              <w:t>8.407</w:t>
+              <w:t>12.976</w:t>
             </w:r>
           </w:p>
         </w:tc>
@@ -357,7 +437,7 @@
           </w:tcPr>
           <w:p>
             <w:r>
-              <w:t>691</w:t>
+              <w:t>921</w:t>
             </w:r>
           </w:p>
         </w:tc>
@@ -379,7 +459,7 @@
           </w:tcPr>
           <w:p>
             <w:r>
-              <w:t>8,2%</w:t>
+              <w:t>7,1%</w:t>
             </w:r>
           </w:p>
         </w:tc>
@@ -401,7 +481,7 @@
           </w:tcPr>
           <w:p>
             <w:r>
-              <w:t>38,39</w:t>
+              <w:t>51,17</w:t>
             </w:r>
           </w:p>
         </w:tc>
@@ -423,7 +503,7 @@
           </w:tcPr>
           <w:p>
             <w:r>
-              <w:t>139,44</w:t>
+              <w:t>195,56</w:t>
             </w:r>
           </w:p>
         </w:tc>
@@ -445,7 +525,7 @@
           </w:tcPr>
           <w:p>
             <w:r>
-              <w:t>138,15</w:t>
+              <w:t>188,19</w:t>
             </w:r>
           </w:p>
         </w:tc>
@@ -467,7 +547,7 @@
           </w:tcPr>
           <w:p>
             <w:r>
-              <w:t>143,56</w:t>
+              <w:t>191,61</w:t>
             </w:r>
           </w:p>
         </w:tc>
@@ -489,7 +569,7 @@
           </w:tcPr>
           <w:p>
             <w:r>
-              <w:t>25,0%</w:t>
+              <w:t>27,9%</w:t>
             </w:r>
           </w:p>
         </w:tc>
@@ -511,7 +591,7 @@
           </w:tcPr>
           <w:p>
             <w:r>
-              <w:t>83,24</w:t>
+              <w:t>113,57</w:t>
             </w:r>
           </w:p>
         </w:tc>
@@ -533,7 +613,7 @@
           </w:tcPr>
           <w:p>
             <w:r>
-              <w:t>83,24</w:t>
+              <w:t>113,57</w:t>
             </w:r>
           </w:p>
         </w:tc>
@@ -555,7 +635,7 @@
           </w:tcPr>
           <w:p>
             <w:r>
-              <w:t>41,0%</w:t>
+              <w:t>46,1%</w:t>
             </w:r>
           </w:p>
         </w:tc>
@@ -894,7 +974,7 @@
           </w:tcPr>
           <w:p>
             <w:r>
-              <w:t>140,12</w:t>
+              <w:t>191,18</w:t>
             </w:r>
           </w:p>
         </w:tc>
@@ -904,7 +984,7 @@
           </w:tcPr>
           <w:p>
             <w:r>
-              <w:t>140,12</w:t>
+              <w:t>191,18</w:t>
             </w:r>
           </w:p>
         </w:tc>
@@ -926,7 +1006,7 @@
           </w:tcPr>
           <w:p>
             <w:r>
-              <w:t>39,59</w:t>
+              <w:t>54,74</w:t>
             </w:r>
           </w:p>
         </w:tc>
@@ -936,7 +1016,7 @@
           </w:tcPr>
           <w:p>
             <w:r>
-              <w:t>29,71</w:t>
+              <w:t>39,48</w:t>
             </w:r>
           </w:p>
         </w:tc>
@@ -958,7 +1038,7 @@
           </w:tcPr>
           <w:p>
             <w:r>
-              <w:t>49,83</w:t>
+              <w:t>67,57</w:t>
             </w:r>
           </w:p>
         </w:tc>
@@ -968,7 +1048,7 @@
           </w:tcPr>
           <w:p>
             <w:r>
-              <w:t>37,73</w:t>
+              <w:t>47,16</w:t>
             </w:r>
           </w:p>
         </w:tc>
@@ -990,7 +1070,7 @@
           </w:tcPr>
           <w:p>
             <w:r>
-              <w:t>35,56</w:t>
+              <w:t>35,34</w:t>
             </w:r>
           </w:p>
         </w:tc>
@@ -1000,7 +1080,7 @@
           </w:tcPr>
           <w:p>
             <w:r>
-              <w:t>26,93</w:t>
+              <w:t>24,67</w:t>
             </w:r>
           </w:p>
         </w:tc>
@@ -1022,7 +1102,7 @@
           </w:tcPr>
           <w:p>
             <w:r>
-              <w:t>245,00</w:t>
+              <w:t>340,00</w:t>
             </w:r>
           </w:p>
         </w:tc>
@@ -1032,7 +1112,7 @@
           </w:tcPr>
           <w:p>
             <w:r>
-              <w:t>167,00</w:t>
+              <w:t>208,00</w:t>
             </w:r>
           </w:p>
         </w:tc>
@@ -1054,7 +1134,7 @@
           </w:tcPr>
           <w:p>
             <w:r>
-              <w:t>28,00</w:t>
+              <w:t>27,00</w:t>
             </w:r>
           </w:p>
         </w:tc>
@@ -1064,7 +1144,7 @@
           </w:tcPr>
           <w:p>
             <w:r>
-              <w:t>32,00</w:t>
+              <w:t>31,00</w:t>
             </w:r>
           </w:p>
         </w:tc>
@@ -1086,7 +1166,7 @@
           </w:tcPr>
           <w:p>
             <w:r>
-              <w:t>32,00</w:t>
+              <w:t>33,00</w:t>
             </w:r>
           </w:p>
         </w:tc>
@@ -1096,7 +1176,7 @@
           </w:tcPr>
           <w:p>
             <w:r>
-              <w:t>28,00</w:t>
+              <w:t>29,00</w:t>
             </w:r>
           </w:p>
         </w:tc>
@@ -1105,7 +1185,7 @@
     <w:p/>
     <w:p>
       <w:r>
-        <w:t>Reducao da MAD: 25,0% | Reducao do desvio-padrao: 24,3% | Reducao do coeficiente de variacao: 24,3% | Situacao: melhora.</w:t>
+        <w:t>Reducao da MAD: 27,9% | Reducao do desvio-padrao: 30,2% | Reducao do coeficiente de variacao: 30,2% | Situacao: melhora.</w:t>
       </w:r>
     </w:p>
     <w:p>
@@ -1192,7 +1272,7 @@
           </w:tcPr>
           <w:p>
             <w:r>
-              <w:t>83,24</w:t>
+              <w:t>113,57</w:t>
             </w:r>
           </w:p>
         </w:tc>
@@ -1202,7 +1282,7 @@
           </w:tcPr>
           <w:p>
             <w:r>
-              <w:t>83,24</w:t>
+              <w:t>113,57</w:t>
             </w:r>
           </w:p>
         </w:tc>
@@ -1224,7 +1304,7 @@
           </w:tcPr>
           <w:p>
             <w:r>
-              <w:t>26,04</w:t>
+              <w:t>34,11</w:t>
             </w:r>
           </w:p>
         </w:tc>
@@ -1234,7 +1314,7 @@
           </w:tcPr>
           <w:p>
             <w:r>
-              <w:t>15,36</w:t>
+              <w:t>18,37</w:t>
             </w:r>
           </w:p>
         </w:tc>
@@ -1256,7 +1336,7 @@
           </w:tcPr>
           <w:p>
             <w:r>
-              <w:t>36,89</w:t>
+              <w:t>50,08</w:t>
             </w:r>
           </w:p>
         </w:tc>
@@ -1266,7 +1346,7 @@
           </w:tcPr>
           <w:p>
             <w:r>
-              <w:t>20,49</w:t>
+              <w:t>24,64</w:t>
             </w:r>
           </w:p>
         </w:tc>
@@ -1288,7 +1368,7 @@
           </w:tcPr>
           <w:p>
             <w:r>
-              <w:t>44,32</w:t>
+              <w:t>44,10</w:t>
             </w:r>
           </w:p>
         </w:tc>
@@ -1298,7 +1378,7 @@
           </w:tcPr>
           <w:p>
             <w:r>
-              <w:t>24,62</w:t>
+              <w:t>21,70</w:t>
             </w:r>
           </w:p>
         </w:tc>
@@ -1320,7 +1400,7 @@
           </w:tcPr>
           <w:p>
             <w:r>
-              <w:t>189,50</w:t>
+              <w:t>257,50</w:t>
             </w:r>
           </w:p>
         </w:tc>
@@ -1330,7 +1410,7 @@
           </w:tcPr>
           <w:p>
             <w:r>
-              <w:t>95,00</w:t>
+              <w:t>105,50</w:t>
             </w:r>
           </w:p>
         </w:tc>
@@ -1352,7 +1432,7 @@
           </w:tcPr>
           <w:p>
             <w:r>
-              <w:t>27,00</w:t>
+              <w:t>26,00</w:t>
             </w:r>
           </w:p>
         </w:tc>
@@ -1384,7 +1464,7 @@
           </w:tcPr>
           <w:p>
             <w:r>
-              <w:t>33,00</w:t>
+              <w:t>34,00</w:t>
             </w:r>
           </w:p>
         </w:tc>
@@ -1408,7 +1488,7 @@
     </w:p>
     <w:p>
       <w:r>
-        <w:t>Reducao da MAD por magistrado: 41,0% | Reducao do desvio-padrao: 44,5% | Reducao do coeficiente de variacao: 44,5% | Situacao: melhora.</w:t>
+        <w:t>Reducao da MAD por magistrado: 46,1% | Reducao do desvio-padrao: 50,8% | Reducao do coeficiente de variacao: 50,8% | Situacao: melhora.</w:t>
       </w:r>
     </w:p>
     <w:p>
@@ -1692,7 +1772,7 @@
           </w:tcPr>
           <w:p>
             <w:r>
-              <w:t>2231</w:t>
+              <w:t>3129</w:t>
             </w:r>
           </w:p>
         </w:tc>
@@ -1702,7 +1782,7 @@
           </w:tcPr>
           <w:p>
             <w:r>
-              <w:t>2920</w:t>
+              <w:t>4048</w:t>
             </w:r>
           </w:p>
         </w:tc>
@@ -1712,7 +1792,7 @@
           </w:tcPr>
           <w:p>
             <w:r>
-              <w:t>139,44</w:t>
+              <w:t>195,56</w:t>
             </w:r>
           </w:p>
         </w:tc>
@@ -1722,7 +1802,7 @@
           </w:tcPr>
           <w:p>
             <w:r>
-              <w:t>182,50</w:t>
+              <w:t>253,00</w:t>
             </w:r>
           </w:p>
         </w:tc>
@@ -1732,7 +1812,7 @@
           </w:tcPr>
           <w:p>
             <w:r>
-              <w:t>31,20</w:t>
+              <w:t>37,99</w:t>
             </w:r>
           </w:p>
         </w:tc>
@@ -1742,7 +1822,7 @@
           </w:tcPr>
           <w:p>
             <w:r>
-              <w:t>34,00</w:t>
+              <w:t>45,38</w:t>
             </w:r>
           </w:p>
         </w:tc>
@@ -1752,7 +1832,7 @@
           </w:tcPr>
           <w:p>
             <w:r>
-              <w:t>-23,60</w:t>
+              <w:t>-22,70</w:t>
             </w:r>
           </w:p>
         </w:tc>
@@ -1762,7 +1842,7 @@
           </w:tcPr>
           <w:p>
             <w:r>
-              <w:t>-8,23</w:t>
+              <w:t>-16,27</w:t>
             </w:r>
           </w:p>
         </w:tc>
@@ -1772,7 +1852,7 @@
           </w:tcPr>
           <w:p>
             <w:r>
-              <w:t>89,24</w:t>
+              <w:t>125,16</w:t>
             </w:r>
           </w:p>
         </w:tc>
@@ -1782,7 +1862,7 @@
           </w:tcPr>
           <w:p>
             <w:r>
-              <w:t>116,80</w:t>
+              <w:t>161,92</w:t>
             </w:r>
           </w:p>
         </w:tc>
@@ -1792,7 +1872,7 @@
           </w:tcPr>
           <w:p>
             <w:r>
-              <w:t>15,13</w:t>
+              <w:t>17,94</w:t>
             </w:r>
           </w:p>
         </w:tc>
@@ -1802,7 +1882,7 @@
           </w:tcPr>
           <w:p>
             <w:r>
-              <w:t>33,37</w:t>
+              <w:t>44,47</w:t>
             </w:r>
           </w:p>
         </w:tc>
@@ -1812,7 +1892,7 @@
           </w:tcPr>
           <w:p>
             <w:r>
-              <w:t>-23,60</w:t>
+              <w:t>-22,70</w:t>
             </w:r>
           </w:p>
         </w:tc>
@@ -1822,7 +1902,7 @@
           </w:tcPr>
           <w:p>
             <w:r>
-              <w:t>-54,67</w:t>
+              <w:t>-59,66</w:t>
             </w:r>
           </w:p>
         </w:tc>
@@ -1854,7 +1934,7 @@
           </w:tcPr>
           <w:p>
             <w:r>
-              <w:t>3592</w:t>
+              <w:t>4893</w:t>
             </w:r>
           </w:p>
         </w:tc>
@@ -1864,7 +1944,7 @@
           </w:tcPr>
           <w:p>
             <w:r>
-              <w:t>3591</w:t>
+              <w:t>4891</w:t>
             </w:r>
           </w:p>
         </w:tc>
@@ -1874,7 +1954,7 @@
           </w:tcPr>
           <w:p>
             <w:r>
-              <w:t>138,15</w:t>
+              <w:t>188,19</w:t>
             </w:r>
           </w:p>
         </w:tc>
@@ -1884,7 +1964,7 @@
           </w:tcPr>
           <w:p>
             <w:r>
-              <w:t>138,12</w:t>
+              <w:t>188,12</w:t>
             </w:r>
           </w:p>
         </w:tc>
@@ -1894,7 +1974,7 @@
           </w:tcPr>
           <w:p>
             <w:r>
-              <w:t>28,59</w:t>
+              <w:t>40,93</w:t>
             </w:r>
           </w:p>
         </w:tc>
@@ -1904,7 +1984,7 @@
           </w:tcPr>
           <w:p>
             <w:r>
-              <w:t>28,56</w:t>
+              <w:t>40,94</w:t>
             </w:r>
           </w:p>
         </w:tc>
@@ -1914,7 +1994,7 @@
           </w:tcPr>
           <w:p>
             <w:r>
-              <w:t>0,03</w:t>
+              <w:t>0,04</w:t>
             </w:r>
           </w:p>
         </w:tc>
@@ -1924,7 +2004,7 @@
           </w:tcPr>
           <w:p>
             <w:r>
-              <w:t>0,11</w:t>
+              <w:t>-0,03</w:t>
             </w:r>
           </w:p>
         </w:tc>
@@ -1934,7 +2014,7 @@
           </w:tcPr>
           <w:p>
             <w:r>
-              <w:t>79,82</w:t>
+              <w:t>108,73</w:t>
             </w:r>
           </w:p>
         </w:tc>
@@ -1944,7 +2024,7 @@
           </w:tcPr>
           <w:p>
             <w:r>
-              <w:t>79,80</w:t>
+              <w:t>108,69</w:t>
             </w:r>
           </w:p>
         </w:tc>
@@ -1954,7 +2034,7 @@
           </w:tcPr>
           <w:p>
             <w:r>
-              <w:t>13,26</w:t>
+              <w:t>16,33</w:t>
             </w:r>
           </w:p>
         </w:tc>
@@ -1964,7 +2044,7 @@
           </w:tcPr>
           <w:p>
             <w:r>
-              <w:t>13,27</w:t>
+              <w:t>16,31</w:t>
             </w:r>
           </w:p>
         </w:tc>
@@ -1974,7 +2054,7 @@
           </w:tcPr>
           <w:p>
             <w:r>
-              <w:t>0,03</w:t>
+              <w:t>0,04</w:t>
             </w:r>
           </w:p>
         </w:tc>
@@ -1984,7 +2064,7 @@
           </w:tcPr>
           <w:p>
             <w:r>
-              <w:t>-0,13</w:t>
+              <w:t>0,10</w:t>
             </w:r>
           </w:p>
         </w:tc>
@@ -2016,7 +2096,7 @@
           </w:tcPr>
           <w:p>
             <w:r>
-              <w:t>2584</w:t>
+              <w:t>3449</w:t>
             </w:r>
           </w:p>
         </w:tc>
@@ -2026,7 +2106,7 @@
           </w:tcPr>
           <w:p>
             <w:r>
-              <w:t>1896</w:t>
+              <w:t>2532</w:t>
             </w:r>
           </w:p>
         </w:tc>
@@ -2036,7 +2116,7 @@
           </w:tcPr>
           <w:p>
             <w:r>
-              <w:t>143,56</w:t>
+              <w:t>191,61</w:t>
             </w:r>
           </w:p>
         </w:tc>
@@ -2046,7 +2126,7 @@
           </w:tcPr>
           <w:p>
             <w:r>
-              <w:t>105,33</w:t>
+              <w:t>140,67</w:t>
             </w:r>
           </w:p>
         </w:tc>
@@ -2056,7 +2136,7 @@
           </w:tcPr>
           <w:p>
             <w:r>
-              <w:t>30,44</w:t>
+              <w:t>38,21</w:t>
             </w:r>
           </w:p>
         </w:tc>
@@ -2066,7 +2146,7 @@
           </w:tcPr>
           <w:p>
             <w:r>
-              <w:t>32,33</w:t>
+              <w:t>39,59</w:t>
             </w:r>
           </w:p>
         </w:tc>
@@ -2076,7 +2156,7 @@
           </w:tcPr>
           <w:p>
             <w:r>
-              <w:t>36,29</w:t>
+              <w:t>36,22</w:t>
             </w:r>
           </w:p>
         </w:tc>
@@ -2086,7 +2166,7 @@
           </w:tcPr>
           <w:p>
             <w:r>
-              <w:t>-5,84</w:t>
+              <w:t>-3,49</w:t>
             </w:r>
           </w:p>
         </w:tc>
@@ -2096,7 +2176,7 @@
           </w:tcPr>
           <w:p>
             <w:r>
-              <w:t>83,35</w:t>
+              <w:t>111,26</w:t>
             </w:r>
           </w:p>
         </w:tc>
@@ -2106,7 +2186,7 @@
           </w:tcPr>
           <w:p>
             <w:r>
-              <w:t>61,16</w:t>
+              <w:t>81,68</w:t>
             </w:r>
           </w:p>
         </w:tc>
@@ -2116,7 +2196,7 @@
           </w:tcPr>
           <w:p>
             <w:r>
-              <w:t>16,55</w:t>
+              <w:t>19,64</w:t>
             </w:r>
           </w:p>
         </w:tc>
@@ -2126,7 +2206,7 @@
           </w:tcPr>
           <w:p>
             <w:r>
-              <w:t>14,87</w:t>
+              <w:t>18,46</w:t>
             </w:r>
           </w:p>
         </w:tc>
@@ -2136,7 +2216,7 @@
           </w:tcPr>
           <w:p>
             <w:r>
-              <w:t>36,29</w:t>
+              <w:t>36,22</w:t>
             </w:r>
           </w:p>
         </w:tc>
@@ -2146,7 +2226,7 @@
           </w:tcPr>
           <w:p>
             <w:r>
-              <w:t>11,31</w:t>
+              <w:t>6,38</w:t>
             </w:r>
           </w:p>
         </w:tc>
@@ -2308,7 +2388,7 @@
           </w:tcPr>
           <w:p>
             <w:r>
-              <w:t>80</w:t>
+              <w:t>95</w:t>
             </w:r>
           </w:p>
         </w:tc>
@@ -2318,7 +2398,7 @@
           </w:tcPr>
           <w:p>
             <w:r>
-              <w:t>11,6%</w:t>
+              <w:t>10,3%</w:t>
             </w:r>
           </w:p>
         </w:tc>
@@ -2338,7 +2418,7 @@
           </w:tcPr>
           <w:p>
             <w:r>
-              <w:t>80,00</w:t>
+              <w:t>95,00</w:t>
             </w:r>
           </w:p>
         </w:tc>
@@ -2348,7 +2428,7 @@
           </w:tcPr>
           <w:p>
             <w:r>
-              <w:t>560,00</w:t>
+              <w:t>665,00</w:t>
             </w:r>
           </w:p>
         </w:tc>
@@ -2390,7 +2470,7 @@
           </w:tcPr>
           <w:p>
             <w:r>
-              <w:t>6,4%</w:t>
+              <w:t>4,8%</w:t>
             </w:r>
           </w:p>
         </w:tc>
@@ -2462,7 +2542,7 @@
           </w:tcPr>
           <w:p>
             <w:r>
-              <w:t>3,2%</w:t>
+              <w:t>2,4%</w:t>
             </w:r>
           </w:p>
         </w:tc>
@@ -2534,7 +2614,7 @@
           </w:tcPr>
           <w:p>
             <w:r>
-              <w:t>6,4%</w:t>
+              <w:t>4,8%</w:t>
             </w:r>
           </w:p>
         </w:tc>
@@ -2606,7 +2686,7 @@
           </w:tcPr>
           <w:p>
             <w:r>
-              <w:t>3,9%</w:t>
+              <w:t>2,9%</w:t>
             </w:r>
           </w:p>
         </w:tc>
@@ -2740,7 +2820,7 @@
           </w:tcPr>
           <w:p>
             <w:r>
-              <w:t>65</w:t>
+              <w:t>76</w:t>
             </w:r>
           </w:p>
         </w:tc>
@@ -2750,7 +2830,7 @@
           </w:tcPr>
           <w:p>
             <w:r>
-              <w:t>9,4%</w:t>
+              <w:t>8,3%</w:t>
             </w:r>
           </w:p>
         </w:tc>
@@ -2770,7 +2850,7 @@
           </w:tcPr>
           <w:p>
             <w:r>
-              <w:t>65,00</w:t>
+              <w:t>76,00</w:t>
             </w:r>
           </w:p>
         </w:tc>
@@ -2780,7 +2860,7 @@
           </w:tcPr>
           <w:p>
             <w:r>
-              <w:t>455,00</w:t>
+              <w:t>532,00</w:t>
             </w:r>
           </w:p>
         </w:tc>
@@ -2894,7 +2974,7 @@
           </w:tcPr>
           <w:p>
             <w:r>
-              <w:t>7,8%</w:t>
+              <w:t>5,9%</w:t>
             </w:r>
           </w:p>
         </w:tc>
@@ -3038,7 +3118,7 @@
           </w:tcPr>
           <w:p>
             <w:r>
-              <w:t>5,2%</w:t>
+              <w:t>3,9%</w:t>
             </w:r>
           </w:p>
         </w:tc>
@@ -3100,7 +3180,7 @@
           </w:tcPr>
           <w:p>
             <w:r>
-              <w:t>76</w:t>
+              <w:t>161</w:t>
             </w:r>
           </w:p>
         </w:tc>
@@ -3110,7 +3190,7 @@
           </w:tcPr>
           <w:p>
             <w:r>
-              <w:t>11,0%</w:t>
+              <w:t>17,5%</w:t>
             </w:r>
           </w:p>
         </w:tc>
@@ -3130,7 +3210,7 @@
           </w:tcPr>
           <w:p>
             <w:r>
-              <w:t>76,00</w:t>
+              <w:t>161,00</w:t>
             </w:r>
           </w:p>
         </w:tc>
@@ -3140,7 +3220,7 @@
           </w:tcPr>
           <w:p>
             <w:r>
-              <w:t>532,00</w:t>
+              <w:t>1.127,00</w:t>
             </w:r>
           </w:p>
         </w:tc>
@@ -3172,7 +3252,7 @@
           </w:tcPr>
           <w:p>
             <w:r>
-              <w:t>42</w:t>
+              <w:t>89</w:t>
             </w:r>
           </w:p>
         </w:tc>
@@ -3182,7 +3262,7 @@
           </w:tcPr>
           <w:p>
             <w:r>
-              <w:t>6,1%</w:t>
+              <w:t>9,7%</w:t>
             </w:r>
           </w:p>
         </w:tc>
@@ -3202,7 +3282,7 @@
           </w:tcPr>
           <w:p>
             <w:r>
-              <w:t>42,00</w:t>
+              <w:t>89,00</w:t>
             </w:r>
           </w:p>
         </w:tc>
@@ -3212,7 +3292,7 @@
           </w:tcPr>
           <w:p>
             <w:r>
-              <w:t>294,00</w:t>
+              <w:t>623,00</w:t>
             </w:r>
           </w:p>
         </w:tc>
@@ -3244,7 +3324,7 @@
           </w:tcPr>
           <w:p>
             <w:r>
-              <w:t>45</w:t>
+              <w:t>46</w:t>
             </w:r>
           </w:p>
         </w:tc>
@@ -3254,7 +3334,7 @@
           </w:tcPr>
           <w:p>
             <w:r>
-              <w:t>6,5%</w:t>
+              <w:t>5,0%</w:t>
             </w:r>
           </w:p>
         </w:tc>
@@ -3274,7 +3354,7 @@
           </w:tcPr>
           <w:p>
             <w:r>
-              <w:t>45,00</w:t>
+              <w:t>46,00</w:t>
             </w:r>
           </w:p>
         </w:tc>
@@ -3284,7 +3364,7 @@
           </w:tcPr>
           <w:p>
             <w:r>
-              <w:t>315,00</w:t>
+              <w:t>322,00</w:t>
             </w:r>
           </w:p>
         </w:tc>
@@ -3316,7 +3396,7 @@
           </w:tcPr>
           <w:p>
             <w:r>
-              <w:t>78</w:t>
+              <w:t>135</w:t>
             </w:r>
           </w:p>
         </w:tc>
@@ -3326,7 +3406,7 @@
           </w:tcPr>
           <w:p>
             <w:r>
-              <w:t>11,3%</w:t>
+              <w:t>14,7%</w:t>
             </w:r>
           </w:p>
         </w:tc>
@@ -3346,7 +3426,7 @@
           </w:tcPr>
           <w:p>
             <w:r>
-              <w:t>78,00</w:t>
+              <w:t>135,00</w:t>
             </w:r>
           </w:p>
         </w:tc>
@@ -3356,7 +3436,7 @@
           </w:tcPr>
           <w:p>
             <w:r>
-              <w:t>546,00</w:t>
+              <w:t>945,00</w:t>
             </w:r>
           </w:p>
         </w:tc>
@@ -3388,7 +3468,7 @@
           </w:tcPr>
           <w:p>
             <w:r>
-              <w:t>78</w:t>
+              <w:t>92</w:t>
             </w:r>
           </w:p>
         </w:tc>
@@ -3398,7 +3478,7 @@
           </w:tcPr>
           <w:p>
             <w:r>
-              <w:t>11,3%</w:t>
+              <w:t>10,0%</w:t>
             </w:r>
           </w:p>
         </w:tc>
@@ -3418,7 +3498,7 @@
           </w:tcPr>
           <w:p>
             <w:r>
-              <w:t>78,00</w:t>
+              <w:t>92,00</w:t>
             </w:r>
           </w:p>
         </w:tc>
@@ -3428,7 +3508,7 @@
           </w:tcPr>
           <w:p>
             <w:r>
-              <w:t>546,00</w:t>
+              <w:t>644,00</w:t>
             </w:r>
           </w:p>
         </w:tc>
@@ -3626,7 +3706,7 @@
           </w:tcPr>
           <w:p>
             <w:r>
-              <w:t>44</w:t>
+              <w:t>51</w:t>
             </w:r>
           </w:p>
         </w:tc>
@@ -3636,7 +3716,7 @@
           </w:tcPr>
           <w:p>
             <w:r>
-              <w:t>6,4%</w:t>
+              <w:t>5,5%</w:t>
             </w:r>
           </w:p>
         </w:tc>
@@ -3656,7 +3736,7 @@
           </w:tcPr>
           <w:p>
             <w:r>
-              <w:t>44,00</w:t>
+              <w:t>51,00</w:t>
             </w:r>
           </w:p>
         </w:tc>
@@ -3666,7 +3746,7 @@
           </w:tcPr>
           <w:p>
             <w:r>
-              <w:t>308,00</w:t>
+              <w:t>357,00</w:t>
             </w:r>
           </w:p>
         </w:tc>
@@ -3698,7 +3778,7 @@
           </w:tcPr>
           <w:p>
             <w:r>
-              <w:t>20</w:t>
+              <w:t>39</w:t>
             </w:r>
           </w:p>
         </w:tc>
@@ -3708,7 +3788,7 @@
           </w:tcPr>
           <w:p>
             <w:r>
-              <w:t>2,9%</w:t>
+              <w:t>4,2%</w:t>
             </w:r>
           </w:p>
         </w:tc>
@@ -3728,7 +3808,7 @@
           </w:tcPr>
           <w:p>
             <w:r>
-              <w:t>20,00</w:t>
+              <w:t>39,00</w:t>
             </w:r>
           </w:p>
         </w:tc>
@@ -3738,7 +3818,7 @@
           </w:tcPr>
           <w:p>
             <w:r>
-              <w:t>140,00</w:t>
+              <w:t>273,00</w:t>
             </w:r>
           </w:p>
         </w:tc>
@@ -3770,7 +3850,7 @@
           </w:tcPr>
           <w:p>
             <w:r>
-              <w:t>31</w:t>
+              <w:t>56</w:t>
             </w:r>
           </w:p>
         </w:tc>
@@ -3780,7 +3860,7 @@
           </w:tcPr>
           <w:p>
             <w:r>
-              <w:t>4,5%</w:t>
+              <w:t>6,1%</w:t>
             </w:r>
           </w:p>
         </w:tc>
@@ -3800,7 +3880,7 @@
           </w:tcPr>
           <w:p>
             <w:r>
-              <w:t>31,00</w:t>
+              <w:t>56,00</w:t>
             </w:r>
           </w:p>
         </w:tc>
@@ -3810,7 +3890,7 @@
           </w:tcPr>
           <w:p>
             <w:r>
-              <w:t>217,00</w:t>
+              <w:t>392,00</w:t>
             </w:r>
           </w:p>
         </w:tc>
@@ -3842,7 +3922,7 @@
           </w:tcPr>
           <w:p>
             <w:r>
-              <w:t>30</w:t>
+              <w:t>52</w:t>
             </w:r>
           </w:p>
         </w:tc>
@@ -3852,7 +3932,7 @@
           </w:tcPr>
           <w:p>
             <w:r>
-              <w:t>4,3%</w:t>
+              <w:t>5,6%</w:t>
             </w:r>
           </w:p>
         </w:tc>
@@ -3872,7 +3952,7 @@
           </w:tcPr>
           <w:p>
             <w:r>
-              <w:t>30,00</w:t>
+              <w:t>52,00</w:t>
             </w:r>
           </w:p>
         </w:tc>
@@ -3882,7 +3962,7 @@
           </w:tcPr>
           <w:p>
             <w:r>
-              <w:t>210,00</w:t>
+              <w:t>364,00</w:t>
             </w:r>
           </w:p>
         </w:tc>
@@ -3914,7 +3994,7 @@
           </w:tcPr>
           <w:p>
             <w:r>
-              <w:t>43</w:t>
+              <w:t>48</w:t>
             </w:r>
           </w:p>
         </w:tc>
@@ -3924,7 +4004,7 @@
           </w:tcPr>
           <w:p>
             <w:r>
-              <w:t>6,2%</w:t>
+              <w:t>5,2%</w:t>
             </w:r>
           </w:p>
         </w:tc>
@@ -3944,7 +4024,7 @@
           </w:tcPr>
           <w:p>
             <w:r>
-              <w:t>43,00</w:t>
+              <w:t>48,00</w:t>
             </w:r>
           </w:p>
         </w:tc>
@@ -3954,7 +4034,7 @@
           </w:tcPr>
           <w:p>
             <w:r>
-              <w:t>301,00</w:t>
+              <w:t>336,00</w:t>
             </w:r>
           </w:p>
         </w:tc>
@@ -3996,7 +4076,7 @@
           </w:tcPr>
           <w:p>
             <w:r>
-              <w:t>4,2%</w:t>
+              <w:t>3,1%</w:t>
             </w:r>
           </w:p>
         </w:tc>
@@ -4058,7 +4138,7 @@
           </w:tcPr>
           <w:p>
             <w:r>
-              <w:t>48</w:t>
+              <w:t>78</w:t>
             </w:r>
           </w:p>
         </w:tc>
@@ -4068,7 +4148,7 @@
           </w:tcPr>
           <w:p>
             <w:r>
-              <w:t>6,9%</w:t>
+              <w:t>8,5%</w:t>
             </w:r>
           </w:p>
         </w:tc>
@@ -4088,7 +4168,7 @@
           </w:tcPr>
           <w:p>
             <w:r>
-              <w:t>48,00</w:t>
+              <w:t>78,00</w:t>
             </w:r>
           </w:p>
         </w:tc>
@@ -4098,7 +4178,7 @@
           </w:tcPr>
           <w:p>
             <w:r>
-              <w:t>336,00</w:t>
+              <w:t>546,00</w:t>
             </w:r>
           </w:p>
         </w:tc>
@@ -4130,7 +4210,7 @@
           </w:tcPr>
           <w:p>
             <w:r>
-              <w:t>48</w:t>
+              <w:t>53</w:t>
             </w:r>
           </w:p>
         </w:tc>
@@ -4140,7 +4220,7 @@
           </w:tcPr>
           <w:p>
             <w:r>
-              <w:t>6,9%</w:t>
+              <w:t>5,8%</w:t>
             </w:r>
           </w:p>
         </w:tc>
@@ -4160,7 +4240,7 @@
           </w:tcPr>
           <w:p>
             <w:r>
-              <w:t>48,00</w:t>
+              <w:t>53,00</w:t>
             </w:r>
           </w:p>
         </w:tc>
@@ -4170,7 +4250,7 @@
           </w:tcPr>
           <w:p>
             <w:r>
-              <w:t>336,00</w:t>
+              <w:t>371,00</w:t>
             </w:r>
           </w:p>
         </w:tc>
@@ -4212,7 +4292,7 @@
           </w:tcPr>
           <w:p>
             <w:r>
-              <w:t>4,3%</w:t>
+              <w:t>3,3%</w:t>
             </w:r>
           </w:p>
         </w:tc>
@@ -4274,7 +4354,7 @@
           </w:tcPr>
           <w:p>
             <w:r>
-              <w:t>48</w:t>
+              <w:t>77</w:t>
             </w:r>
           </w:p>
         </w:tc>
@@ -4284,7 +4364,7 @@
           </w:tcPr>
           <w:p>
             <w:r>
-              <w:t>6,9%</w:t>
+              <w:t>8,4%</w:t>
             </w:r>
           </w:p>
         </w:tc>
@@ -4304,7 +4384,7 @@
           </w:tcPr>
           <w:p>
             <w:r>
-              <w:t>48,00</w:t>
+              <w:t>77,00</w:t>
             </w:r>
           </w:p>
         </w:tc>
@@ -4314,7 +4394,7 @@
           </w:tcPr>
           <w:p>
             <w:r>
-              <w:t>336,00</w:t>
+              <w:t>539,00</w:t>
             </w:r>
           </w:p>
         </w:tc>
@@ -4346,7 +4426,7 @@
           </w:tcPr>
           <w:p>
             <w:r>
-              <w:t>42</w:t>
+              <w:t>46</w:t>
             </w:r>
           </w:p>
         </w:tc>
@@ -4356,7 +4436,7 @@
           </w:tcPr>
           <w:p>
             <w:r>
-              <w:t>6,1%</w:t>
+              <w:t>5,0%</w:t>
             </w:r>
           </w:p>
         </w:tc>
@@ -4376,7 +4456,7 @@
           </w:tcPr>
           <w:p>
             <w:r>
-              <w:t>42,00</w:t>
+              <w:t>46,00</w:t>
             </w:r>
           </w:p>
         </w:tc>
@@ -4386,7 +4466,7 @@
           </w:tcPr>
           <w:p>
             <w:r>
-              <w:t>294,00</w:t>
+              <w:t>322,00</w:t>
             </w:r>
           </w:p>
         </w:tc>
@@ -4418,7 +4498,7 @@
           </w:tcPr>
           <w:p>
             <w:r>
-              <w:t>26</w:t>
+              <w:t>48</w:t>
             </w:r>
           </w:p>
         </w:tc>
@@ -4428,7 +4508,7 @@
           </w:tcPr>
           <w:p>
             <w:r>
-              <w:t>3,8%</w:t>
+              <w:t>5,2%</w:t>
             </w:r>
           </w:p>
         </w:tc>
@@ -4448,7 +4528,7 @@
           </w:tcPr>
           <w:p>
             <w:r>
-              <w:t>26,00</w:t>
+              <w:t>48,00</w:t>
             </w:r>
           </w:p>
         </w:tc>
@@ -4458,7 +4538,7 @@
           </w:tcPr>
           <w:p>
             <w:r>
-              <w:t>182,00</w:t>
+              <w:t>336,00</w:t>
             </w:r>
           </w:p>
         </w:tc>
@@ -4490,7 +4570,7 @@
           </w:tcPr>
           <w:p>
             <w:r>
-              <w:t>44</w:t>
+              <w:t>76</w:t>
             </w:r>
           </w:p>
         </w:tc>
@@ -4500,7 +4580,7 @@
           </w:tcPr>
           <w:p>
             <w:r>
-              <w:t>6,4%</w:t>
+              <w:t>8,3%</w:t>
             </w:r>
           </w:p>
         </w:tc>
@@ -4520,7 +4600,7 @@
           </w:tcPr>
           <w:p>
             <w:r>
-              <w:t>44,00</w:t>
+              <w:t>76,00</w:t>
             </w:r>
           </w:p>
         </w:tc>
@@ -4530,7 +4610,7 @@
           </w:tcPr>
           <w:p>
             <w:r>
-              <w:t>308,00</w:t>
+              <w:t>532,00</w:t>
             </w:r>
           </w:p>
         </w:tc>
@@ -4572,7 +4652,7 @@
           </w:tcPr>
           <w:p>
             <w:r>
-              <w:t>4,2%</w:t>
+              <w:t>3,1%</w:t>
             </w:r>
           </w:p>
         </w:tc>
@@ -4644,7 +4724,7 @@
           </w:tcPr>
           <w:p>
             <w:r>
-              <w:t>8,0%</w:t>
+              <w:t>6,0%</w:t>
             </w:r>
           </w:p>
         </w:tc>
@@ -4716,7 +4796,7 @@
           </w:tcPr>
           <w:p>
             <w:r>
-              <w:t>3,9%</w:t>
+              <w:t>2,9%</w:t>
             </w:r>
           </w:p>
         </w:tc>
@@ -4778,7 +4858,7 @@
           </w:tcPr>
           <w:p>
             <w:r>
-              <w:t>53</w:t>
+              <w:t>59</w:t>
             </w:r>
           </w:p>
         </w:tc>
@@ -4788,7 +4868,7 @@
           </w:tcPr>
           <w:p>
             <w:r>
-              <w:t>7,7%</w:t>
+              <w:t>6,4%</w:t>
             </w:r>
           </w:p>
         </w:tc>
@@ -4808,7 +4888,7 @@
           </w:tcPr>
           <w:p>
             <w:r>
-              <w:t>53,00</w:t>
+              <w:t>59,00</w:t>
             </w:r>
           </w:p>
         </w:tc>
@@ -4818,7 +4898,7 @@
           </w:tcPr>
           <w:p>
             <w:r>
-              <w:t>371,00</w:t>
+              <w:t>413,00</w:t>
             </w:r>
           </w:p>
         </w:tc>
@@ -4850,7 +4930,7 @@
           </w:tcPr>
           <w:p>
             <w:r>
-              <w:t>44</w:t>
+              <w:t>68</w:t>
             </w:r>
           </w:p>
         </w:tc>
@@ -4860,7 +4940,7 @@
           </w:tcPr>
           <w:p>
             <w:r>
-              <w:t>6,4%</w:t>
+              <w:t>7,4%</w:t>
             </w:r>
           </w:p>
         </w:tc>
@@ -4880,7 +4960,7 @@
           </w:tcPr>
           <w:p>
             <w:r>
-              <w:t>44,00</w:t>
+              <w:t>68,00</w:t>
             </w:r>
           </w:p>
         </w:tc>
@@ -4890,7 +4970,7 @@
           </w:tcPr>
           <w:p>
             <w:r>
-              <w:t>308,00</w:t>
+              <w:t>476,00</w:t>
             </w:r>
           </w:p>
         </w:tc>
@@ -4951,7 +5031,7 @@
     </w:p>
     <w:p>
       <w:r>
-        <w:t>Quantidade de pares cedente-destinataria: 215 | Participacao das dez maiores rotas: 13,9%</w:t>
+        <w:t>Quantidade de pares cedente-destinataria: 215 | Participacao das dez maiores rotas: 16,9%</w:t>
       </w:r>
     </w:p>
     <w:tbl>
@@ -5031,7 +5111,7 @@
           </w:tcPr>
           <w:p>
             <w:r>
-              <w:t>VARA DO TRABALHO DE SÃO MIGUEL DO OESTE</w:t>
+              <w:t>VARA DO TRABALHO DE ITAPEMA</w:t>
             </w:r>
           </w:p>
         </w:tc>
@@ -5041,7 +5121,7 @@
           </w:tcPr>
           <w:p>
             <w:r>
-              <w:t>2ª VARA DO TRABALHO DE TUBARÃO</w:t>
+              <w:t>2ª VARA DO TRABALHO DE LAGES</w:t>
             </w:r>
           </w:p>
         </w:tc>
@@ -5051,7 +5131,7 @@
           </w:tcPr>
           <w:p>
             <w:r>
-              <w:t>14</w:t>
+              <w:t>20</w:t>
             </w:r>
           </w:p>
         </w:tc>
@@ -5061,7 +5141,7 @@
           </w:tcPr>
           <w:p>
             <w:r>
-              <w:t>2,0%</w:t>
+              <w:t>2,2%</w:t>
             </w:r>
           </w:p>
         </w:tc>
@@ -5073,7 +5153,7 @@
           </w:tcPr>
           <w:p>
             <w:r>
-              <w:t>1ª VARA DO TRABALHO DE CHAPECÓ</w:t>
+              <w:t>VARA DO TRABALHO DE ITAPEMA</w:t>
             </w:r>
           </w:p>
         </w:tc>
@@ -5083,7 +5163,7 @@
           </w:tcPr>
           <w:p>
             <w:r>
-              <w:t>3ª VARA DO TRABALHO DE LAGES</w:t>
+              <w:t>1ª VARA DO TRABALHO DE LAGES</w:t>
             </w:r>
           </w:p>
         </w:tc>
@@ -5093,7 +5173,7 @@
           </w:tcPr>
           <w:p>
             <w:r>
-              <w:t>10</w:t>
+              <w:t>18</w:t>
             </w:r>
           </w:p>
         </w:tc>
@@ -5103,7 +5183,7 @@
           </w:tcPr>
           <w:p>
             <w:r>
-              <w:t>1,4%</w:t>
+              <w:t>2,0%</w:t>
             </w:r>
           </w:p>
         </w:tc>
@@ -5115,7 +5195,7 @@
           </w:tcPr>
           <w:p>
             <w:r>
-              <w:t>1ª VARA DO TRABALHO DE CHAPECÓ</w:t>
+              <w:t>VARA DO TRABALHO DE ITAPEMA</w:t>
             </w:r>
           </w:p>
         </w:tc>
@@ -5125,7 +5205,7 @@
           </w:tcPr>
           <w:p>
             <w:r>
-              <w:t>VARA DO TRABALHO DE MAFRA</w:t>
+              <w:t>VARA DO TRABALHO DE CANOINHAS</w:t>
             </w:r>
           </w:p>
         </w:tc>
@@ -5135,7 +5215,7 @@
           </w:tcPr>
           <w:p>
             <w:r>
-              <w:t>10</w:t>
+              <w:t>18</w:t>
             </w:r>
           </w:p>
         </w:tc>
@@ -5145,7 +5225,7 @@
           </w:tcPr>
           <w:p>
             <w:r>
-              <w:t>1,4%</w:t>
+              <w:t>2,0%</w:t>
             </w:r>
           </w:p>
         </w:tc>
@@ -5167,7 +5247,7 @@
           </w:tcPr>
           <w:p>
             <w:r>
-              <w:t>2ª VARA DO TRABALHO DE LAGES</w:t>
+              <w:t>2ª VARA DO TRABALHO DE TUBARÃO</w:t>
             </w:r>
           </w:p>
         </w:tc>
@@ -5177,7 +5257,7 @@
           </w:tcPr>
           <w:p>
             <w:r>
-              <w:t>9</w:t>
+              <w:t>16</w:t>
             </w:r>
           </w:p>
         </w:tc>
@@ -5187,7 +5267,7 @@
           </w:tcPr>
           <w:p>
             <w:r>
-              <w:t>1,3%</w:t>
+              <w:t>1,7%</w:t>
             </w:r>
           </w:p>
         </w:tc>
@@ -5199,7 +5279,7 @@
           </w:tcPr>
           <w:p>
             <w:r>
-              <w:t>4ª VARA DO TRABALHO DE CHAPECÓ</w:t>
+              <w:t>VARA DO TRABALHO DE SÃO MIGUEL DO OESTE</w:t>
             </w:r>
           </w:p>
         </w:tc>
@@ -5209,7 +5289,7 @@
           </w:tcPr>
           <w:p>
             <w:r>
-              <w:t>3ª VARA DO TRABALHO DE LAGES</w:t>
+              <w:t>2ª VARA DO TRABALHO DE LAGES</w:t>
             </w:r>
           </w:p>
         </w:tc>
@@ -5219,7 +5299,7 @@
           </w:tcPr>
           <w:p>
             <w:r>
-              <w:t>9</w:t>
+              <w:t>16</w:t>
             </w:r>
           </w:p>
         </w:tc>
@@ -5229,7 +5309,7 @@
           </w:tcPr>
           <w:p>
             <w:r>
-              <w:t>1,3%</w:t>
+              <w:t>1,7%</w:t>
             </w:r>
           </w:p>
         </w:tc>
@@ -5241,7 +5321,7 @@
           </w:tcPr>
           <w:p>
             <w:r>
-              <w:t>VARA DO TRABALHO DE XANXERÊ</w:t>
+              <w:t>VARA DO TRABALHO DE ITAPEMA</w:t>
             </w:r>
           </w:p>
         </w:tc>
@@ -5251,7 +5331,7 @@
           </w:tcPr>
           <w:p>
             <w:r>
-              <w:t>2ª VARA DO TRABALHO DE TUBARÃO</w:t>
+              <w:t>VARA DO TRABALHO DE SÃO BENTO DO SUL</w:t>
             </w:r>
           </w:p>
         </w:tc>
@@ -5261,7 +5341,7 @@
           </w:tcPr>
           <w:p>
             <w:r>
-              <w:t>9</w:t>
+              <w:t>15</w:t>
             </w:r>
           </w:p>
         </w:tc>
@@ -5271,7 +5351,7 @@
           </w:tcPr>
           <w:p>
             <w:r>
-              <w:t>1,3%</w:t>
+              <w:t>1,6%</w:t>
             </w:r>
           </w:p>
         </w:tc>
@@ -5283,7 +5363,7 @@
           </w:tcPr>
           <w:p>
             <w:r>
-              <w:t>1ª VARA DO TRABALHO DE CHAPECÓ</w:t>
+              <w:t>VARA DO TRABALHO DE ITAPEMA</w:t>
             </w:r>
           </w:p>
         </w:tc>
@@ -5293,7 +5373,7 @@
           </w:tcPr>
           <w:p>
             <w:r>
-              <w:t>2ª VARA DO TRABALHO DE LAGES</w:t>
+              <w:t>VARA DO TRABALHO DE ARARANGUÁ</w:t>
             </w:r>
           </w:p>
         </w:tc>
@@ -5303,7 +5383,7 @@
           </w:tcPr>
           <w:p>
             <w:r>
-              <w:t>9</w:t>
+              <w:t>14</w:t>
             </w:r>
           </w:p>
         </w:tc>
@@ -5313,7 +5393,7 @@
           </w:tcPr>
           <w:p>
             <w:r>
-              <w:t>1,3%</w:t>
+              <w:t>1,5%</w:t>
             </w:r>
           </w:p>
         </w:tc>
@@ -5335,7 +5415,7 @@
           </w:tcPr>
           <w:p>
             <w:r>
-              <w:t>2ª VARA DO TRABALHO DE LAGES</w:t>
+              <w:t>1ª VARA DO TRABALHO DE BRUSQUE</w:t>
             </w:r>
           </w:p>
         </w:tc>
@@ -5345,7 +5425,7 @@
           </w:tcPr>
           <w:p>
             <w:r>
-              <w:t>9</w:t>
+              <w:t>13</w:t>
             </w:r>
           </w:p>
         </w:tc>
@@ -5355,7 +5435,7 @@
           </w:tcPr>
           <w:p>
             <w:r>
-              <w:t>1,3%</w:t>
+              <w:t>1,4%</w:t>
             </w:r>
           </w:p>
         </w:tc>
@@ -5367,7 +5447,7 @@
           </w:tcPr>
           <w:p>
             <w:r>
-              <w:t>VARA DO TRABALHO DE ITAPEMA</w:t>
+              <w:t>VARA DO TRABALHO DE SÃO MIGUEL DO OESTE</w:t>
             </w:r>
           </w:p>
         </w:tc>
@@ -5377,7 +5457,7 @@
           </w:tcPr>
           <w:p>
             <w:r>
-              <w:t>VARA DO TRABALHO DE FRAIBURGO</w:t>
+              <w:t>3ª VARA DO TRABALHO DE LAGES</w:t>
             </w:r>
           </w:p>
         </w:tc>
@@ -5387,7 +5467,7 @@
           </w:tcPr>
           <w:p>
             <w:r>
-              <w:t>9</w:t>
+              <w:t>13</w:t>
             </w:r>
           </w:p>
         </w:tc>
@@ -5397,7 +5477,7 @@
           </w:tcPr>
           <w:p>
             <w:r>
-              <w:t>1,3%</w:t>
+              <w:t>1,4%</w:t>
             </w:r>
           </w:p>
         </w:tc>
@@ -5409,7 +5489,7 @@
           </w:tcPr>
           <w:p>
             <w:r>
-              <w:t>4ª VARA DO TRABALHO DE CHAPECÓ</w:t>
+              <w:t>VARA DO TRABALHO DE SÃO MIGUEL DO OESTE</w:t>
             </w:r>
           </w:p>
         </w:tc>
@@ -5419,7 +5499,7 @@
           </w:tcPr>
           <w:p>
             <w:r>
-              <w:t>VARA DO TRABALHO DE SÃO BENTO DO SUL</w:t>
+              <w:t>VARA DO TRABALHO DE CANOINHAS</w:t>
             </w:r>
           </w:p>
         </w:tc>
@@ -5429,7 +5509,7 @@
           </w:tcPr>
           <w:p>
             <w:r>
-              <w:t>8</w:t>
+              <w:t>13</w:t>
             </w:r>
           </w:p>
         </w:tc>
@@ -5439,7 +5519,7 @@
           </w:tcPr>
           <w:p>
             <w:r>
-              <w:t>1,2%</w:t>
+              <w:t>1,4%</w:t>
             </w:r>
           </w:p>
         </w:tc>
@@ -5678,7 +5758,7 @@
           </w:tcPr>
           <w:p>
             <w:r>
-              <w:t>3502</w:t>
+              <w:t>5820</w:t>
             </w:r>
           </w:p>
         </w:tc>
@@ -5688,7 +5768,7 @@
           </w:tcPr>
           <w:p>
             <w:r>
-              <w:t>386</w:t>
+              <w:t>520</w:t>
             </w:r>
           </w:p>
         </w:tc>
@@ -5698,7 +5778,7 @@
           </w:tcPr>
           <w:p>
             <w:r>
-              <w:t>11,0%</w:t>
+              <w:t>8,9%</w:t>
             </w:r>
           </w:p>
         </w:tc>
@@ -5720,7 +5800,7 @@
           </w:tcPr>
           <w:p>
             <w:r>
-              <w:t>2982</w:t>
+              <w:t>4684</w:t>
             </w:r>
           </w:p>
         </w:tc>
@@ -5730,7 +5810,7 @@
           </w:tcPr>
           <w:p>
             <w:r>
-              <w:t>281</w:t>
+              <w:t>373</w:t>
             </w:r>
           </w:p>
         </w:tc>
@@ -5740,7 +5820,7 @@
           </w:tcPr>
           <w:p>
             <w:r>
-              <w:t>9,4%</w:t>
+              <w:t>8,0%</w:t>
             </w:r>
           </w:p>
         </w:tc>
@@ -5762,7 +5842,7 @@
           </w:tcPr>
           <w:p>
             <w:r>
-              <w:t>575</w:t>
+              <w:t>705</w:t>
             </w:r>
           </w:p>
         </w:tc>
@@ -5804,7 +5884,7 @@
           </w:tcPr>
           <w:p>
             <w:r>
-              <w:t>531</w:t>
+              <w:t>647</w:t>
             </w:r>
           </w:p>
         </w:tc>
@@ -5836,7 +5916,7 @@
           </w:tcPr>
           <w:p>
             <w:r>
-              <w:t>CONSIGNACAO EM PAGAMENTO</w:t>
+              <w:t>PRODUCAO ANTECIPADA DA PROVA</w:t>
             </w:r>
           </w:p>
         </w:tc>
@@ -5846,7 +5926,7 @@
           </w:tcPr>
           <w:p>
             <w:r>
-              <w:t>145</w:t>
+              <w:t>202</w:t>
             </w:r>
           </w:p>
         </w:tc>
@@ -5856,7 +5936,7 @@
           </w:tcPr>
           <w:p>
             <w:r>
-              <w:t>13</w:t>
+              <w:t>0</w:t>
             </w:r>
           </w:p>
         </w:tc>
@@ -5866,7 +5946,7 @@
           </w:tcPr>
           <w:p>
             <w:r>
-              <w:t>9,0%</w:t>
+              <w:t>0,0%</w:t>
             </w:r>
           </w:p>
         </w:tc>
@@ -5878,7 +5958,7 @@
           </w:tcPr>
           <w:p>
             <w:r>
-              <w:t>PRODUCAO ANTECIPADA DA PROVA</w:t>
+              <w:t>CONSIGNACAO EM PAGAMENTO</w:t>
             </w:r>
           </w:p>
         </w:tc>
@@ -5888,7 +5968,7 @@
           </w:tcPr>
           <w:p>
             <w:r>
-              <w:t>144</w:t>
+              <w:t>191</w:t>
             </w:r>
           </w:p>
         </w:tc>
@@ -5898,7 +5978,7 @@
           </w:tcPr>
           <w:p>
             <w:r>
-              <w:t>0</w:t>
+              <w:t>17</w:t>
             </w:r>
           </w:p>
         </w:tc>
@@ -5908,7 +5988,7 @@
           </w:tcPr>
           <w:p>
             <w:r>
-              <w:t>0,0%</w:t>
+              <w:t>8,9%</w:t>
             </w:r>
           </w:p>
         </w:tc>
@@ -5930,7 +6010,7 @@
           </w:tcPr>
           <w:p>
             <w:r>
-              <w:t>110</w:t>
+              <w:t>127</w:t>
             </w:r>
           </w:p>
         </w:tc>
@@ -5972,7 +6052,7 @@
           </w:tcPr>
           <w:p>
             <w:r>
-              <w:t>79</w:t>
+              <w:t>109</w:t>
             </w:r>
           </w:p>
         </w:tc>
@@ -6004,7 +6084,7 @@
           </w:tcPr>
           <w:p>
             <w:r>
-              <w:t>CUMPRIMENTO DE SENTENCA</w:t>
+              <w:t>EMBARGOS DE TERCEIRO CIVEL</w:t>
             </w:r>
           </w:p>
         </w:tc>
@@ -6014,7 +6094,7 @@
           </w:tcPr>
           <w:p>
             <w:r>
-              <w:t>64</w:t>
+              <w:t>90</w:t>
             </w:r>
           </w:p>
         </w:tc>
@@ -6046,7 +6126,7 @@
           </w:tcPr>
           <w:p>
             <w:r>
-              <w:t>EMBARGOS DE TERCEIRO CIVEL</w:t>
+              <w:t>CUMPRIMENTO DE SENTENCA</w:t>
             </w:r>
           </w:p>
         </w:tc>
@@ -6056,7 +6136,7 @@
           </w:tcPr>
           <w:p>
             <w:r>
-              <w:t>60</w:t>
+              <w:t>78</w:t>
             </w:r>
           </w:p>
         </w:tc>
@@ -6088,7 +6168,7 @@
           </w:tcPr>
           <w:p>
             <w:r>
-              <w:t>CARTA DE ORDEM CIVEL</w:t>
+              <w:t>ACAO TRABALHISTA - RITO SUMARIO (ALCADA)</w:t>
             </w:r>
           </w:p>
         </w:tc>
@@ -6098,7 +6178,7 @@
           </w:tcPr>
           <w:p>
             <w:r>
-              <w:t>46</w:t>
+              <w:t>68</w:t>
             </w:r>
           </w:p>
         </w:tc>
@@ -6108,7 +6188,7 @@
           </w:tcPr>
           <w:p>
             <w:r>
-              <w:t>0</w:t>
+              <w:t>3</w:t>
             </w:r>
           </w:p>
         </w:tc>
@@ -6118,7 +6198,7 @@
           </w:tcPr>
           <w:p>
             <w:r>
-              <w:t>0,0%</w:t>
+              <w:t>4,4%</w:t>
             </w:r>
           </w:p>
         </w:tc>
@@ -6130,7 +6210,7 @@
           </w:tcPr>
           <w:p>
             <w:r>
-              <w:t>ACAO TRABALHISTA - RITO SUMARIO (ALCADA)</w:t>
+              <w:t>CARTA DE ORDEM CIVEL</w:t>
             </w:r>
           </w:p>
         </w:tc>
@@ -6140,7 +6220,7 @@
           </w:tcPr>
           <w:p>
             <w:r>
-              <w:t>43</w:t>
+              <w:t>68</w:t>
             </w:r>
           </w:p>
         </w:tc>
@@ -6150,7 +6230,7 @@
           </w:tcPr>
           <w:p>
             <w:r>
-              <w:t>3</w:t>
+              <w:t>0</w:t>
             </w:r>
           </w:p>
         </w:tc>
@@ -6160,7 +6240,7 @@
           </w:tcPr>
           <w:p>
             <w:r>
-              <w:t>7,0%</w:t>
+              <w:t>0,0%</w:t>
             </w:r>
           </w:p>
         </w:tc>
@@ -6172,7 +6252,7 @@
           </w:tcPr>
           <w:p>
             <w:r>
-              <w:t>PEDIDO DE PROVIDENCIAS</w:t>
+              <w:t>ACAO CIVIL COLETIVA</w:t>
             </w:r>
           </w:p>
         </w:tc>
@@ -6182,7 +6262,7 @@
           </w:tcPr>
           <w:p>
             <w:r>
-              <w:t>22</w:t>
+              <w:t>28</w:t>
             </w:r>
           </w:p>
         </w:tc>
@@ -6214,7 +6294,7 @@
           </w:tcPr>
           <w:p>
             <w:r>
-              <w:t>ACAO CIVIL COLETIVA</w:t>
+              <w:t>PEDIDO DE PROVIDENCIAS</w:t>
             </w:r>
           </w:p>
         </w:tc>
@@ -6224,7 +6304,7 @@
           </w:tcPr>
           <w:p>
             <w:r>
-              <w:t>17</w:t>
+              <w:t>27</w:t>
             </w:r>
           </w:p>
         </w:tc>
@@ -6266,7 +6346,7 @@
           </w:tcPr>
           <w:p>
             <w:r>
-              <w:t>17</w:t>
+              <w:t>23</w:t>
             </w:r>
           </w:p>
         </w:tc>
@@ -6368,7 +6448,7 @@
           </w:tcPr>
           <w:p>
             <w:r>
-              <w:t>11.712</w:t>
+              <w:t>18.891</w:t>
             </w:r>
           </w:p>
         </w:tc>
@@ -6390,7 +6470,7 @@
           </w:tcPr>
           <w:p>
             <w:r>
-              <w:t>23</w:t>
+              <w:t>33</w:t>
             </w:r>
           </w:p>
         </w:tc>
@@ -6412,7 +6492,7 @@
           </w:tcPr>
           <w:p>
             <w:r>
-              <w:t>3</w:t>
+              <w:t>5</w:t>
             </w:r>
           </w:p>
         </w:tc>
@@ -6434,7 +6514,7 @@
           </w:tcPr>
           <w:p>
             <w:r>
-              <w:t>11.709</w:t>
+              <w:t>18.886</w:t>
             </w:r>
           </w:p>
         </w:tc>
@@ -6456,7 +6536,7 @@
           </w:tcPr>
           <w:p>
             <w:r>
-              <w:t>103</w:t>
+              <w:t>1.624</w:t>
             </w:r>
           </w:p>
         </w:tc>
@@ -6478,7 +6558,7 @@
           </w:tcPr>
           <w:p>
             <w:r>
-              <w:t>1.694</w:t>
+              <w:t>3.756</w:t>
             </w:r>
           </w:p>
         </w:tc>
@@ -6500,7 +6580,7 @@
           </w:tcPr>
           <w:p>
             <w:r>
-              <w:t>8.407</w:t>
+              <w:t>12.976</w:t>
             </w:r>
           </w:p>
         </w:tc>
@@ -6522,7 +6602,7 @@
           </w:tcPr>
           <w:p>
             <w:r>
-              <w:t>0</w:t>
+              <w:t>1</w:t>
             </w:r>
           </w:p>
         </w:tc>
@@ -6566,7 +6646,7 @@
           </w:tcPr>
           <w:p>
             <w:r>
-              <w:t>23/07/2026</w:t>
+              <w:t>02/08/2026</w:t>
             </w:r>
           </w:p>
         </w:tc>
@@ -6637,7 +6717,7 @@
           </w:tcPr>
           <w:p>
             <w:r>
-              <w:t>89</w:t>
+              <w:t>1607</w:t>
             </w:r>
           </w:p>
         </w:tc>
@@ -6649,7 +6729,7 @@
           </w:tcPr>
           <w:p>
             <w:r>
-              <w:t>ORDEM_CRONOLOGICA_AMBIGUA</w:t>
+              <w:t>UNIDADE_NAO_CLASSIFICADA</w:t>
             </w:r>
           </w:p>
         </w:tc>
@@ -6659,7 +6739,7 @@
           </w:tcPr>
           <w:p>
             <w:r>
-              <w:t>10</w:t>
+              <w:t>1507</w:t>
             </w:r>
           </w:p>
         </w:tc>
@@ -6671,6 +6751,28 @@
           </w:tcPr>
           <w:p>
             <w:r>
+              <w:t>ORDEM_CRONOLOGICA_AMBIGUA</w:t>
+            </w:r>
+          </w:p>
+        </w:tc>
+        <w:tc>
+          <w:tcPr>
+            <w:tcW w:type="dxa" w:w="4819"/>
+          </w:tcPr>
+          <w:p>
+            <w:r>
+              <w:t>12</w:t>
+            </w:r>
+          </w:p>
+        </w:tc>
+      </w:tr>
+      <w:tr>
+        <w:tc>
+          <w:tcPr>
+            <w:tcW w:type="dxa" w:w="4819"/>
+          </w:tcPr>
+          <w:p>
+            <w:r>
               <w:t>MOVIMENTACAO_DUPLICADA_REMOVIDA</w:t>
             </w:r>
           </w:p>
@@ -6681,7 +6783,29 @@
           </w:tcPr>
           <w:p>
             <w:r>
-              <w:t>3</w:t>
+              <w:t>5</w:t>
+            </w:r>
+          </w:p>
+        </w:tc>
+      </w:tr>
+      <w:tr>
+        <w:tc>
+          <w:tcPr>
+            <w:tcW w:type="dxa" w:w="4819"/>
+          </w:tcPr>
+          <w:p>
+            <w:r>
+              <w:t>CLASSE_JUDICIAL_DIVERGENTE</w:t>
+            </w:r>
+          </w:p>
+        </w:tc>
+        <w:tc>
+          <w:tcPr>
+            <w:tcW w:type="dxa" w:w="4819"/>
+          </w:tcPr>
+          <w:p>
+            <w:r>
+              <w:t>1</w:t>
             </w:r>
           </w:p>
         </w:tc>
@@ -6803,7 +6927,7 @@
       <w:fldChar w:fldCharType="end"/>
     </w:r>
     <w:r>
-      <w:t xml:space="preserve"> | Atualizado em 24/07/2026 11:29</w:t>
+      <w:t xml:space="preserve"> | Atualizado em 03/08/2026 16:46</w:t>
     </w:r>
   </w:p>
 </w:ftr>

</xml_diff>